<commit_message>
feat: apprenants dynamiques dans la feuille de presence
- Bouton "+ Ajouter un apprenant" dans la modal
- Bouton x pour supprimer un apprenant
- Template etendu a 20 lignes max
- Pre-rempli avec les apprenants existants

Co-Authored-By: Claude Opus 4.6 (1M context) <noreply@anthropic.com>
</commit_message>
<xml_diff>
--- a/templates/feuille_presence_template.docx
+++ b/templates/feuille_presence_template.docx
@@ -1071,6 +1071,1170 @@
                 <w:szCs w:val="18"/>
               </w:rPr>
               <w:t xml:space="preserve">{{hours_8}}</w:t>
+            </w:r>
+          </w:p>
+        </w:tc>
+      </w:tr>
+      <w:tr>
+        <w:trPr>
+          <w:trHeight w:val="600" w:hRule="atLeast"/>
+        </w:trPr>
+        <w:tc>
+          <w:tcPr>
+            <w:tcW w:type="dxa" w:w="2600"/>
+            <w:tcBorders>
+              <w:top w:val="single" w:color="E91E8C" w:sz="4"/>
+              <w:left w:val="single" w:color="E91E8C" w:sz="4"/>
+              <w:bottom w:val="single" w:color="E91E8C" w:sz="4"/>
+              <w:right w:val="single" w:color="E91E8C" w:sz="4"/>
+            </w:tcBorders>
+            <w:vAlign w:val="center"/>
+          </w:tcPr>
+          <w:p>
+            <w:r>
+              <w:rPr>
+                <w:rFonts w:ascii="Arial" w:cs="Arial" w:eastAsia="Arial" w:hAnsi="Arial"/>
+                <w:color w:val="333333"/>
+                <w:sz w:val="18"/>
+                <w:szCs w:val="18"/>
+              </w:rPr>
+              <w:t xml:space="preserve">{{learner_9}}</w:t>
+            </w:r>
+          </w:p>
+        </w:tc>
+        <w:tc>
+          <w:tcPr>
+            <w:tcW w:type="dxa" w:w="2000"/>
+            <w:tcBorders>
+              <w:top w:val="single" w:color="E91E8C" w:sz="4"/>
+              <w:left w:val="single" w:color="E91E8C" w:sz="4"/>
+              <w:bottom w:val="single" w:color="E91E8C" w:sz="4"/>
+              <w:right w:val="single" w:color="E91E8C" w:sz="4"/>
+            </w:tcBorders>
+            <w:vAlign w:val="center"/>
+          </w:tcPr>
+          <w:p>
+            <w:r>
+              <w:rPr>
+                <w:rFonts w:ascii="Arial" w:cs="Arial" w:eastAsia="Arial" w:hAnsi="Arial"/>
+                <w:color w:val="333333"/>
+                <w:sz w:val="18"/>
+                <w:szCs w:val="18"/>
+              </w:rPr>
+              <w:t xml:space="preserve"> </w:t>
+            </w:r>
+          </w:p>
+        </w:tc>
+        <w:tc>
+          <w:tcPr>
+            <w:tcW w:type="dxa" w:w="2000"/>
+            <w:tcBorders>
+              <w:top w:val="single" w:color="E91E8C" w:sz="4"/>
+              <w:left w:val="single" w:color="E91E8C" w:sz="4"/>
+              <w:bottom w:val="single" w:color="E91E8C" w:sz="4"/>
+              <w:right w:val="single" w:color="E91E8C" w:sz="4"/>
+            </w:tcBorders>
+            <w:vAlign w:val="center"/>
+          </w:tcPr>
+          <w:p>
+            <w:r>
+              <w:rPr>
+                <w:rFonts w:ascii="Arial" w:cs="Arial" w:eastAsia="Arial" w:hAnsi="Arial"/>
+                <w:color w:val="333333"/>
+                <w:sz w:val="18"/>
+                <w:szCs w:val="18"/>
+              </w:rPr>
+              <w:t xml:space="preserve"> </w:t>
+            </w:r>
+          </w:p>
+        </w:tc>
+        <w:tc>
+          <w:tcPr>
+            <w:tcW w:type="dxa" w:w="2600"/>
+            <w:tcBorders>
+              <w:top w:val="single" w:color="E91E8C" w:sz="4"/>
+              <w:left w:val="single" w:color="E91E8C" w:sz="4"/>
+              <w:bottom w:val="single" w:color="E91E8C" w:sz="4"/>
+              <w:right w:val="single" w:color="E91E8C" w:sz="4"/>
+            </w:tcBorders>
+            <w:vAlign w:val="center"/>
+          </w:tcPr>
+          <w:p>
+            <w:r>
+              <w:rPr>
+                <w:rFonts w:ascii="Arial" w:cs="Arial" w:eastAsia="Arial" w:hAnsi="Arial"/>
+                <w:color w:val="333333"/>
+                <w:sz w:val="18"/>
+                <w:szCs w:val="18"/>
+              </w:rPr>
+              <w:t xml:space="preserve">{{hours_9}}</w:t>
+            </w:r>
+          </w:p>
+        </w:tc>
+      </w:tr>
+      <w:tr>
+        <w:trPr>
+          <w:trHeight w:val="600" w:hRule="atLeast"/>
+        </w:trPr>
+        <w:tc>
+          <w:tcPr>
+            <w:tcW w:type="dxa" w:w="2600"/>
+            <w:tcBorders>
+              <w:top w:val="single" w:color="E91E8C" w:sz="4"/>
+              <w:left w:val="single" w:color="E91E8C" w:sz="4"/>
+              <w:bottom w:val="single" w:color="E91E8C" w:sz="4"/>
+              <w:right w:val="single" w:color="E91E8C" w:sz="4"/>
+            </w:tcBorders>
+            <w:vAlign w:val="center"/>
+          </w:tcPr>
+          <w:p>
+            <w:r>
+              <w:rPr>
+                <w:rFonts w:ascii="Arial" w:cs="Arial" w:eastAsia="Arial" w:hAnsi="Arial"/>
+                <w:color w:val="333333"/>
+                <w:sz w:val="18"/>
+                <w:szCs w:val="18"/>
+              </w:rPr>
+              <w:t xml:space="preserve">{{learner_10}}</w:t>
+            </w:r>
+          </w:p>
+        </w:tc>
+        <w:tc>
+          <w:tcPr>
+            <w:tcW w:type="dxa" w:w="2000"/>
+            <w:tcBorders>
+              <w:top w:val="single" w:color="E91E8C" w:sz="4"/>
+              <w:left w:val="single" w:color="E91E8C" w:sz="4"/>
+              <w:bottom w:val="single" w:color="E91E8C" w:sz="4"/>
+              <w:right w:val="single" w:color="E91E8C" w:sz="4"/>
+            </w:tcBorders>
+            <w:vAlign w:val="center"/>
+          </w:tcPr>
+          <w:p>
+            <w:r>
+              <w:rPr>
+                <w:rFonts w:ascii="Arial" w:cs="Arial" w:eastAsia="Arial" w:hAnsi="Arial"/>
+                <w:color w:val="333333"/>
+                <w:sz w:val="18"/>
+                <w:szCs w:val="18"/>
+              </w:rPr>
+              <w:t xml:space="preserve"> </w:t>
+            </w:r>
+          </w:p>
+        </w:tc>
+        <w:tc>
+          <w:tcPr>
+            <w:tcW w:type="dxa" w:w="2000"/>
+            <w:tcBorders>
+              <w:top w:val="single" w:color="E91E8C" w:sz="4"/>
+              <w:left w:val="single" w:color="E91E8C" w:sz="4"/>
+              <w:bottom w:val="single" w:color="E91E8C" w:sz="4"/>
+              <w:right w:val="single" w:color="E91E8C" w:sz="4"/>
+            </w:tcBorders>
+            <w:vAlign w:val="center"/>
+          </w:tcPr>
+          <w:p>
+            <w:r>
+              <w:rPr>
+                <w:rFonts w:ascii="Arial" w:cs="Arial" w:eastAsia="Arial" w:hAnsi="Arial"/>
+                <w:color w:val="333333"/>
+                <w:sz w:val="18"/>
+                <w:szCs w:val="18"/>
+              </w:rPr>
+              <w:t xml:space="preserve"> </w:t>
+            </w:r>
+          </w:p>
+        </w:tc>
+        <w:tc>
+          <w:tcPr>
+            <w:tcW w:type="dxa" w:w="2600"/>
+            <w:tcBorders>
+              <w:top w:val="single" w:color="E91E8C" w:sz="4"/>
+              <w:left w:val="single" w:color="E91E8C" w:sz="4"/>
+              <w:bottom w:val="single" w:color="E91E8C" w:sz="4"/>
+              <w:right w:val="single" w:color="E91E8C" w:sz="4"/>
+            </w:tcBorders>
+            <w:vAlign w:val="center"/>
+          </w:tcPr>
+          <w:p>
+            <w:r>
+              <w:rPr>
+                <w:rFonts w:ascii="Arial" w:cs="Arial" w:eastAsia="Arial" w:hAnsi="Arial"/>
+                <w:color w:val="333333"/>
+                <w:sz w:val="18"/>
+                <w:szCs w:val="18"/>
+              </w:rPr>
+              <w:t xml:space="preserve">{{hours_10}}</w:t>
+            </w:r>
+          </w:p>
+        </w:tc>
+      </w:tr>
+      <w:tr>
+        <w:trPr>
+          <w:trHeight w:val="600" w:hRule="atLeast"/>
+        </w:trPr>
+        <w:tc>
+          <w:tcPr>
+            <w:tcW w:type="dxa" w:w="2600"/>
+            <w:tcBorders>
+              <w:top w:val="single" w:color="E91E8C" w:sz="4"/>
+              <w:left w:val="single" w:color="E91E8C" w:sz="4"/>
+              <w:bottom w:val="single" w:color="E91E8C" w:sz="4"/>
+              <w:right w:val="single" w:color="E91E8C" w:sz="4"/>
+            </w:tcBorders>
+            <w:vAlign w:val="center"/>
+          </w:tcPr>
+          <w:p>
+            <w:r>
+              <w:rPr>
+                <w:rFonts w:ascii="Arial" w:cs="Arial" w:eastAsia="Arial" w:hAnsi="Arial"/>
+                <w:color w:val="333333"/>
+                <w:sz w:val="18"/>
+                <w:szCs w:val="18"/>
+              </w:rPr>
+              <w:t xml:space="preserve">{{learner_11}}</w:t>
+            </w:r>
+          </w:p>
+        </w:tc>
+        <w:tc>
+          <w:tcPr>
+            <w:tcW w:type="dxa" w:w="2000"/>
+            <w:tcBorders>
+              <w:top w:val="single" w:color="E91E8C" w:sz="4"/>
+              <w:left w:val="single" w:color="E91E8C" w:sz="4"/>
+              <w:bottom w:val="single" w:color="E91E8C" w:sz="4"/>
+              <w:right w:val="single" w:color="E91E8C" w:sz="4"/>
+            </w:tcBorders>
+            <w:vAlign w:val="center"/>
+          </w:tcPr>
+          <w:p>
+            <w:r>
+              <w:rPr>
+                <w:rFonts w:ascii="Arial" w:cs="Arial" w:eastAsia="Arial" w:hAnsi="Arial"/>
+                <w:color w:val="333333"/>
+                <w:sz w:val="18"/>
+                <w:szCs w:val="18"/>
+              </w:rPr>
+              <w:t xml:space="preserve"> </w:t>
+            </w:r>
+          </w:p>
+        </w:tc>
+        <w:tc>
+          <w:tcPr>
+            <w:tcW w:type="dxa" w:w="2000"/>
+            <w:tcBorders>
+              <w:top w:val="single" w:color="E91E8C" w:sz="4"/>
+              <w:left w:val="single" w:color="E91E8C" w:sz="4"/>
+              <w:bottom w:val="single" w:color="E91E8C" w:sz="4"/>
+              <w:right w:val="single" w:color="E91E8C" w:sz="4"/>
+            </w:tcBorders>
+            <w:vAlign w:val="center"/>
+          </w:tcPr>
+          <w:p>
+            <w:r>
+              <w:rPr>
+                <w:rFonts w:ascii="Arial" w:cs="Arial" w:eastAsia="Arial" w:hAnsi="Arial"/>
+                <w:color w:val="333333"/>
+                <w:sz w:val="18"/>
+                <w:szCs w:val="18"/>
+              </w:rPr>
+              <w:t xml:space="preserve"> </w:t>
+            </w:r>
+          </w:p>
+        </w:tc>
+        <w:tc>
+          <w:tcPr>
+            <w:tcW w:type="dxa" w:w="2600"/>
+            <w:tcBorders>
+              <w:top w:val="single" w:color="E91E8C" w:sz="4"/>
+              <w:left w:val="single" w:color="E91E8C" w:sz="4"/>
+              <w:bottom w:val="single" w:color="E91E8C" w:sz="4"/>
+              <w:right w:val="single" w:color="E91E8C" w:sz="4"/>
+            </w:tcBorders>
+            <w:vAlign w:val="center"/>
+          </w:tcPr>
+          <w:p>
+            <w:r>
+              <w:rPr>
+                <w:rFonts w:ascii="Arial" w:cs="Arial" w:eastAsia="Arial" w:hAnsi="Arial"/>
+                <w:color w:val="333333"/>
+                <w:sz w:val="18"/>
+                <w:szCs w:val="18"/>
+              </w:rPr>
+              <w:t xml:space="preserve">{{hours_11}}</w:t>
+            </w:r>
+          </w:p>
+        </w:tc>
+      </w:tr>
+      <w:tr>
+        <w:trPr>
+          <w:trHeight w:val="600" w:hRule="atLeast"/>
+        </w:trPr>
+        <w:tc>
+          <w:tcPr>
+            <w:tcW w:type="dxa" w:w="2600"/>
+            <w:tcBorders>
+              <w:top w:val="single" w:color="E91E8C" w:sz="4"/>
+              <w:left w:val="single" w:color="E91E8C" w:sz="4"/>
+              <w:bottom w:val="single" w:color="E91E8C" w:sz="4"/>
+              <w:right w:val="single" w:color="E91E8C" w:sz="4"/>
+            </w:tcBorders>
+            <w:vAlign w:val="center"/>
+          </w:tcPr>
+          <w:p>
+            <w:r>
+              <w:rPr>
+                <w:rFonts w:ascii="Arial" w:cs="Arial" w:eastAsia="Arial" w:hAnsi="Arial"/>
+                <w:color w:val="333333"/>
+                <w:sz w:val="18"/>
+                <w:szCs w:val="18"/>
+              </w:rPr>
+              <w:t xml:space="preserve">{{learner_12}}</w:t>
+            </w:r>
+          </w:p>
+        </w:tc>
+        <w:tc>
+          <w:tcPr>
+            <w:tcW w:type="dxa" w:w="2000"/>
+            <w:tcBorders>
+              <w:top w:val="single" w:color="E91E8C" w:sz="4"/>
+              <w:left w:val="single" w:color="E91E8C" w:sz="4"/>
+              <w:bottom w:val="single" w:color="E91E8C" w:sz="4"/>
+              <w:right w:val="single" w:color="E91E8C" w:sz="4"/>
+            </w:tcBorders>
+            <w:vAlign w:val="center"/>
+          </w:tcPr>
+          <w:p>
+            <w:r>
+              <w:rPr>
+                <w:rFonts w:ascii="Arial" w:cs="Arial" w:eastAsia="Arial" w:hAnsi="Arial"/>
+                <w:color w:val="333333"/>
+                <w:sz w:val="18"/>
+                <w:szCs w:val="18"/>
+              </w:rPr>
+              <w:t xml:space="preserve"> </w:t>
+            </w:r>
+          </w:p>
+        </w:tc>
+        <w:tc>
+          <w:tcPr>
+            <w:tcW w:type="dxa" w:w="2000"/>
+            <w:tcBorders>
+              <w:top w:val="single" w:color="E91E8C" w:sz="4"/>
+              <w:left w:val="single" w:color="E91E8C" w:sz="4"/>
+              <w:bottom w:val="single" w:color="E91E8C" w:sz="4"/>
+              <w:right w:val="single" w:color="E91E8C" w:sz="4"/>
+            </w:tcBorders>
+            <w:vAlign w:val="center"/>
+          </w:tcPr>
+          <w:p>
+            <w:r>
+              <w:rPr>
+                <w:rFonts w:ascii="Arial" w:cs="Arial" w:eastAsia="Arial" w:hAnsi="Arial"/>
+                <w:color w:val="333333"/>
+                <w:sz w:val="18"/>
+                <w:szCs w:val="18"/>
+              </w:rPr>
+              <w:t xml:space="preserve"> </w:t>
+            </w:r>
+          </w:p>
+        </w:tc>
+        <w:tc>
+          <w:tcPr>
+            <w:tcW w:type="dxa" w:w="2600"/>
+            <w:tcBorders>
+              <w:top w:val="single" w:color="E91E8C" w:sz="4"/>
+              <w:left w:val="single" w:color="E91E8C" w:sz="4"/>
+              <w:bottom w:val="single" w:color="E91E8C" w:sz="4"/>
+              <w:right w:val="single" w:color="E91E8C" w:sz="4"/>
+            </w:tcBorders>
+            <w:vAlign w:val="center"/>
+          </w:tcPr>
+          <w:p>
+            <w:r>
+              <w:rPr>
+                <w:rFonts w:ascii="Arial" w:cs="Arial" w:eastAsia="Arial" w:hAnsi="Arial"/>
+                <w:color w:val="333333"/>
+                <w:sz w:val="18"/>
+                <w:szCs w:val="18"/>
+              </w:rPr>
+              <w:t xml:space="preserve">{{hours_12}}</w:t>
+            </w:r>
+          </w:p>
+        </w:tc>
+      </w:tr>
+      <w:tr>
+        <w:trPr>
+          <w:trHeight w:val="600" w:hRule="atLeast"/>
+        </w:trPr>
+        <w:tc>
+          <w:tcPr>
+            <w:tcW w:type="dxa" w:w="2600"/>
+            <w:tcBorders>
+              <w:top w:val="single" w:color="E91E8C" w:sz="4"/>
+              <w:left w:val="single" w:color="E91E8C" w:sz="4"/>
+              <w:bottom w:val="single" w:color="E91E8C" w:sz="4"/>
+              <w:right w:val="single" w:color="E91E8C" w:sz="4"/>
+            </w:tcBorders>
+            <w:vAlign w:val="center"/>
+          </w:tcPr>
+          <w:p>
+            <w:r>
+              <w:rPr>
+                <w:rFonts w:ascii="Arial" w:cs="Arial" w:eastAsia="Arial" w:hAnsi="Arial"/>
+                <w:color w:val="333333"/>
+                <w:sz w:val="18"/>
+                <w:szCs w:val="18"/>
+              </w:rPr>
+              <w:t xml:space="preserve">{{learner_13}}</w:t>
+            </w:r>
+          </w:p>
+        </w:tc>
+        <w:tc>
+          <w:tcPr>
+            <w:tcW w:type="dxa" w:w="2000"/>
+            <w:tcBorders>
+              <w:top w:val="single" w:color="E91E8C" w:sz="4"/>
+              <w:left w:val="single" w:color="E91E8C" w:sz="4"/>
+              <w:bottom w:val="single" w:color="E91E8C" w:sz="4"/>
+              <w:right w:val="single" w:color="E91E8C" w:sz="4"/>
+            </w:tcBorders>
+            <w:vAlign w:val="center"/>
+          </w:tcPr>
+          <w:p>
+            <w:r>
+              <w:rPr>
+                <w:rFonts w:ascii="Arial" w:cs="Arial" w:eastAsia="Arial" w:hAnsi="Arial"/>
+                <w:color w:val="333333"/>
+                <w:sz w:val="18"/>
+                <w:szCs w:val="18"/>
+              </w:rPr>
+              <w:t xml:space="preserve"> </w:t>
+            </w:r>
+          </w:p>
+        </w:tc>
+        <w:tc>
+          <w:tcPr>
+            <w:tcW w:type="dxa" w:w="2000"/>
+            <w:tcBorders>
+              <w:top w:val="single" w:color="E91E8C" w:sz="4"/>
+              <w:left w:val="single" w:color="E91E8C" w:sz="4"/>
+              <w:bottom w:val="single" w:color="E91E8C" w:sz="4"/>
+              <w:right w:val="single" w:color="E91E8C" w:sz="4"/>
+            </w:tcBorders>
+            <w:vAlign w:val="center"/>
+          </w:tcPr>
+          <w:p>
+            <w:r>
+              <w:rPr>
+                <w:rFonts w:ascii="Arial" w:cs="Arial" w:eastAsia="Arial" w:hAnsi="Arial"/>
+                <w:color w:val="333333"/>
+                <w:sz w:val="18"/>
+                <w:szCs w:val="18"/>
+              </w:rPr>
+              <w:t xml:space="preserve"> </w:t>
+            </w:r>
+          </w:p>
+        </w:tc>
+        <w:tc>
+          <w:tcPr>
+            <w:tcW w:type="dxa" w:w="2600"/>
+            <w:tcBorders>
+              <w:top w:val="single" w:color="E91E8C" w:sz="4"/>
+              <w:left w:val="single" w:color="E91E8C" w:sz="4"/>
+              <w:bottom w:val="single" w:color="E91E8C" w:sz="4"/>
+              <w:right w:val="single" w:color="E91E8C" w:sz="4"/>
+            </w:tcBorders>
+            <w:vAlign w:val="center"/>
+          </w:tcPr>
+          <w:p>
+            <w:r>
+              <w:rPr>
+                <w:rFonts w:ascii="Arial" w:cs="Arial" w:eastAsia="Arial" w:hAnsi="Arial"/>
+                <w:color w:val="333333"/>
+                <w:sz w:val="18"/>
+                <w:szCs w:val="18"/>
+              </w:rPr>
+              <w:t xml:space="preserve">{{hours_13}}</w:t>
+            </w:r>
+          </w:p>
+        </w:tc>
+      </w:tr>
+      <w:tr>
+        <w:trPr>
+          <w:trHeight w:val="600" w:hRule="atLeast"/>
+        </w:trPr>
+        <w:tc>
+          <w:tcPr>
+            <w:tcW w:type="dxa" w:w="2600"/>
+            <w:tcBorders>
+              <w:top w:val="single" w:color="E91E8C" w:sz="4"/>
+              <w:left w:val="single" w:color="E91E8C" w:sz="4"/>
+              <w:bottom w:val="single" w:color="E91E8C" w:sz="4"/>
+              <w:right w:val="single" w:color="E91E8C" w:sz="4"/>
+            </w:tcBorders>
+            <w:vAlign w:val="center"/>
+          </w:tcPr>
+          <w:p>
+            <w:r>
+              <w:rPr>
+                <w:rFonts w:ascii="Arial" w:cs="Arial" w:eastAsia="Arial" w:hAnsi="Arial"/>
+                <w:color w:val="333333"/>
+                <w:sz w:val="18"/>
+                <w:szCs w:val="18"/>
+              </w:rPr>
+              <w:t xml:space="preserve">{{learner_14}}</w:t>
+            </w:r>
+          </w:p>
+        </w:tc>
+        <w:tc>
+          <w:tcPr>
+            <w:tcW w:type="dxa" w:w="2000"/>
+            <w:tcBorders>
+              <w:top w:val="single" w:color="E91E8C" w:sz="4"/>
+              <w:left w:val="single" w:color="E91E8C" w:sz="4"/>
+              <w:bottom w:val="single" w:color="E91E8C" w:sz="4"/>
+              <w:right w:val="single" w:color="E91E8C" w:sz="4"/>
+            </w:tcBorders>
+            <w:vAlign w:val="center"/>
+          </w:tcPr>
+          <w:p>
+            <w:r>
+              <w:rPr>
+                <w:rFonts w:ascii="Arial" w:cs="Arial" w:eastAsia="Arial" w:hAnsi="Arial"/>
+                <w:color w:val="333333"/>
+                <w:sz w:val="18"/>
+                <w:szCs w:val="18"/>
+              </w:rPr>
+              <w:t xml:space="preserve"> </w:t>
+            </w:r>
+          </w:p>
+        </w:tc>
+        <w:tc>
+          <w:tcPr>
+            <w:tcW w:type="dxa" w:w="2000"/>
+            <w:tcBorders>
+              <w:top w:val="single" w:color="E91E8C" w:sz="4"/>
+              <w:left w:val="single" w:color="E91E8C" w:sz="4"/>
+              <w:bottom w:val="single" w:color="E91E8C" w:sz="4"/>
+              <w:right w:val="single" w:color="E91E8C" w:sz="4"/>
+            </w:tcBorders>
+            <w:vAlign w:val="center"/>
+          </w:tcPr>
+          <w:p>
+            <w:r>
+              <w:rPr>
+                <w:rFonts w:ascii="Arial" w:cs="Arial" w:eastAsia="Arial" w:hAnsi="Arial"/>
+                <w:color w:val="333333"/>
+                <w:sz w:val="18"/>
+                <w:szCs w:val="18"/>
+              </w:rPr>
+              <w:t xml:space="preserve"> </w:t>
+            </w:r>
+          </w:p>
+        </w:tc>
+        <w:tc>
+          <w:tcPr>
+            <w:tcW w:type="dxa" w:w="2600"/>
+            <w:tcBorders>
+              <w:top w:val="single" w:color="E91E8C" w:sz="4"/>
+              <w:left w:val="single" w:color="E91E8C" w:sz="4"/>
+              <w:bottom w:val="single" w:color="E91E8C" w:sz="4"/>
+              <w:right w:val="single" w:color="E91E8C" w:sz="4"/>
+            </w:tcBorders>
+            <w:vAlign w:val="center"/>
+          </w:tcPr>
+          <w:p>
+            <w:r>
+              <w:rPr>
+                <w:rFonts w:ascii="Arial" w:cs="Arial" w:eastAsia="Arial" w:hAnsi="Arial"/>
+                <w:color w:val="333333"/>
+                <w:sz w:val="18"/>
+                <w:szCs w:val="18"/>
+              </w:rPr>
+              <w:t xml:space="preserve">{{hours_14}}</w:t>
+            </w:r>
+          </w:p>
+        </w:tc>
+      </w:tr>
+      <w:tr>
+        <w:trPr>
+          <w:trHeight w:val="600" w:hRule="atLeast"/>
+        </w:trPr>
+        <w:tc>
+          <w:tcPr>
+            <w:tcW w:type="dxa" w:w="2600"/>
+            <w:tcBorders>
+              <w:top w:val="single" w:color="E91E8C" w:sz="4"/>
+              <w:left w:val="single" w:color="E91E8C" w:sz="4"/>
+              <w:bottom w:val="single" w:color="E91E8C" w:sz="4"/>
+              <w:right w:val="single" w:color="E91E8C" w:sz="4"/>
+            </w:tcBorders>
+            <w:vAlign w:val="center"/>
+          </w:tcPr>
+          <w:p>
+            <w:r>
+              <w:rPr>
+                <w:rFonts w:ascii="Arial" w:cs="Arial" w:eastAsia="Arial" w:hAnsi="Arial"/>
+                <w:color w:val="333333"/>
+                <w:sz w:val="18"/>
+                <w:szCs w:val="18"/>
+              </w:rPr>
+              <w:t xml:space="preserve">{{learner_15}}</w:t>
+            </w:r>
+          </w:p>
+        </w:tc>
+        <w:tc>
+          <w:tcPr>
+            <w:tcW w:type="dxa" w:w="2000"/>
+            <w:tcBorders>
+              <w:top w:val="single" w:color="E91E8C" w:sz="4"/>
+              <w:left w:val="single" w:color="E91E8C" w:sz="4"/>
+              <w:bottom w:val="single" w:color="E91E8C" w:sz="4"/>
+              <w:right w:val="single" w:color="E91E8C" w:sz="4"/>
+            </w:tcBorders>
+            <w:vAlign w:val="center"/>
+          </w:tcPr>
+          <w:p>
+            <w:r>
+              <w:rPr>
+                <w:rFonts w:ascii="Arial" w:cs="Arial" w:eastAsia="Arial" w:hAnsi="Arial"/>
+                <w:color w:val="333333"/>
+                <w:sz w:val="18"/>
+                <w:szCs w:val="18"/>
+              </w:rPr>
+              <w:t xml:space="preserve"> </w:t>
+            </w:r>
+          </w:p>
+        </w:tc>
+        <w:tc>
+          <w:tcPr>
+            <w:tcW w:type="dxa" w:w="2000"/>
+            <w:tcBorders>
+              <w:top w:val="single" w:color="E91E8C" w:sz="4"/>
+              <w:left w:val="single" w:color="E91E8C" w:sz="4"/>
+              <w:bottom w:val="single" w:color="E91E8C" w:sz="4"/>
+              <w:right w:val="single" w:color="E91E8C" w:sz="4"/>
+            </w:tcBorders>
+            <w:vAlign w:val="center"/>
+          </w:tcPr>
+          <w:p>
+            <w:r>
+              <w:rPr>
+                <w:rFonts w:ascii="Arial" w:cs="Arial" w:eastAsia="Arial" w:hAnsi="Arial"/>
+                <w:color w:val="333333"/>
+                <w:sz w:val="18"/>
+                <w:szCs w:val="18"/>
+              </w:rPr>
+              <w:t xml:space="preserve"> </w:t>
+            </w:r>
+          </w:p>
+        </w:tc>
+        <w:tc>
+          <w:tcPr>
+            <w:tcW w:type="dxa" w:w="2600"/>
+            <w:tcBorders>
+              <w:top w:val="single" w:color="E91E8C" w:sz="4"/>
+              <w:left w:val="single" w:color="E91E8C" w:sz="4"/>
+              <w:bottom w:val="single" w:color="E91E8C" w:sz="4"/>
+              <w:right w:val="single" w:color="E91E8C" w:sz="4"/>
+            </w:tcBorders>
+            <w:vAlign w:val="center"/>
+          </w:tcPr>
+          <w:p>
+            <w:r>
+              <w:rPr>
+                <w:rFonts w:ascii="Arial" w:cs="Arial" w:eastAsia="Arial" w:hAnsi="Arial"/>
+                <w:color w:val="333333"/>
+                <w:sz w:val="18"/>
+                <w:szCs w:val="18"/>
+              </w:rPr>
+              <w:t xml:space="preserve">{{hours_15}}</w:t>
+            </w:r>
+          </w:p>
+        </w:tc>
+      </w:tr>
+      <w:tr>
+        <w:trPr>
+          <w:trHeight w:val="600" w:hRule="atLeast"/>
+        </w:trPr>
+        <w:tc>
+          <w:tcPr>
+            <w:tcW w:type="dxa" w:w="2600"/>
+            <w:tcBorders>
+              <w:top w:val="single" w:color="E91E8C" w:sz="4"/>
+              <w:left w:val="single" w:color="E91E8C" w:sz="4"/>
+              <w:bottom w:val="single" w:color="E91E8C" w:sz="4"/>
+              <w:right w:val="single" w:color="E91E8C" w:sz="4"/>
+            </w:tcBorders>
+            <w:vAlign w:val="center"/>
+          </w:tcPr>
+          <w:p>
+            <w:r>
+              <w:rPr>
+                <w:rFonts w:ascii="Arial" w:cs="Arial" w:eastAsia="Arial" w:hAnsi="Arial"/>
+                <w:color w:val="333333"/>
+                <w:sz w:val="18"/>
+                <w:szCs w:val="18"/>
+              </w:rPr>
+              <w:t xml:space="preserve">{{learner_16}}</w:t>
+            </w:r>
+          </w:p>
+        </w:tc>
+        <w:tc>
+          <w:tcPr>
+            <w:tcW w:type="dxa" w:w="2000"/>
+            <w:tcBorders>
+              <w:top w:val="single" w:color="E91E8C" w:sz="4"/>
+              <w:left w:val="single" w:color="E91E8C" w:sz="4"/>
+              <w:bottom w:val="single" w:color="E91E8C" w:sz="4"/>
+              <w:right w:val="single" w:color="E91E8C" w:sz="4"/>
+            </w:tcBorders>
+            <w:vAlign w:val="center"/>
+          </w:tcPr>
+          <w:p>
+            <w:r>
+              <w:rPr>
+                <w:rFonts w:ascii="Arial" w:cs="Arial" w:eastAsia="Arial" w:hAnsi="Arial"/>
+                <w:color w:val="333333"/>
+                <w:sz w:val="18"/>
+                <w:szCs w:val="18"/>
+              </w:rPr>
+              <w:t xml:space="preserve"> </w:t>
+            </w:r>
+          </w:p>
+        </w:tc>
+        <w:tc>
+          <w:tcPr>
+            <w:tcW w:type="dxa" w:w="2000"/>
+            <w:tcBorders>
+              <w:top w:val="single" w:color="E91E8C" w:sz="4"/>
+              <w:left w:val="single" w:color="E91E8C" w:sz="4"/>
+              <w:bottom w:val="single" w:color="E91E8C" w:sz="4"/>
+              <w:right w:val="single" w:color="E91E8C" w:sz="4"/>
+            </w:tcBorders>
+            <w:vAlign w:val="center"/>
+          </w:tcPr>
+          <w:p>
+            <w:r>
+              <w:rPr>
+                <w:rFonts w:ascii="Arial" w:cs="Arial" w:eastAsia="Arial" w:hAnsi="Arial"/>
+                <w:color w:val="333333"/>
+                <w:sz w:val="18"/>
+                <w:szCs w:val="18"/>
+              </w:rPr>
+              <w:t xml:space="preserve"> </w:t>
+            </w:r>
+          </w:p>
+        </w:tc>
+        <w:tc>
+          <w:tcPr>
+            <w:tcW w:type="dxa" w:w="2600"/>
+            <w:tcBorders>
+              <w:top w:val="single" w:color="E91E8C" w:sz="4"/>
+              <w:left w:val="single" w:color="E91E8C" w:sz="4"/>
+              <w:bottom w:val="single" w:color="E91E8C" w:sz="4"/>
+              <w:right w:val="single" w:color="E91E8C" w:sz="4"/>
+            </w:tcBorders>
+            <w:vAlign w:val="center"/>
+          </w:tcPr>
+          <w:p>
+            <w:r>
+              <w:rPr>
+                <w:rFonts w:ascii="Arial" w:cs="Arial" w:eastAsia="Arial" w:hAnsi="Arial"/>
+                <w:color w:val="333333"/>
+                <w:sz w:val="18"/>
+                <w:szCs w:val="18"/>
+              </w:rPr>
+              <w:t xml:space="preserve">{{hours_16}}</w:t>
+            </w:r>
+          </w:p>
+        </w:tc>
+      </w:tr>
+      <w:tr>
+        <w:trPr>
+          <w:trHeight w:val="600" w:hRule="atLeast"/>
+        </w:trPr>
+        <w:tc>
+          <w:tcPr>
+            <w:tcW w:type="dxa" w:w="2600"/>
+            <w:tcBorders>
+              <w:top w:val="single" w:color="E91E8C" w:sz="4"/>
+              <w:left w:val="single" w:color="E91E8C" w:sz="4"/>
+              <w:bottom w:val="single" w:color="E91E8C" w:sz="4"/>
+              <w:right w:val="single" w:color="E91E8C" w:sz="4"/>
+            </w:tcBorders>
+            <w:vAlign w:val="center"/>
+          </w:tcPr>
+          <w:p>
+            <w:r>
+              <w:rPr>
+                <w:rFonts w:ascii="Arial" w:cs="Arial" w:eastAsia="Arial" w:hAnsi="Arial"/>
+                <w:color w:val="333333"/>
+                <w:sz w:val="18"/>
+                <w:szCs w:val="18"/>
+              </w:rPr>
+              <w:t xml:space="preserve">{{learner_17}}</w:t>
+            </w:r>
+          </w:p>
+        </w:tc>
+        <w:tc>
+          <w:tcPr>
+            <w:tcW w:type="dxa" w:w="2000"/>
+            <w:tcBorders>
+              <w:top w:val="single" w:color="E91E8C" w:sz="4"/>
+              <w:left w:val="single" w:color="E91E8C" w:sz="4"/>
+              <w:bottom w:val="single" w:color="E91E8C" w:sz="4"/>
+              <w:right w:val="single" w:color="E91E8C" w:sz="4"/>
+            </w:tcBorders>
+            <w:vAlign w:val="center"/>
+          </w:tcPr>
+          <w:p>
+            <w:r>
+              <w:rPr>
+                <w:rFonts w:ascii="Arial" w:cs="Arial" w:eastAsia="Arial" w:hAnsi="Arial"/>
+                <w:color w:val="333333"/>
+                <w:sz w:val="18"/>
+                <w:szCs w:val="18"/>
+              </w:rPr>
+              <w:t xml:space="preserve"> </w:t>
+            </w:r>
+          </w:p>
+        </w:tc>
+        <w:tc>
+          <w:tcPr>
+            <w:tcW w:type="dxa" w:w="2000"/>
+            <w:tcBorders>
+              <w:top w:val="single" w:color="E91E8C" w:sz="4"/>
+              <w:left w:val="single" w:color="E91E8C" w:sz="4"/>
+              <w:bottom w:val="single" w:color="E91E8C" w:sz="4"/>
+              <w:right w:val="single" w:color="E91E8C" w:sz="4"/>
+            </w:tcBorders>
+            <w:vAlign w:val="center"/>
+          </w:tcPr>
+          <w:p>
+            <w:r>
+              <w:rPr>
+                <w:rFonts w:ascii="Arial" w:cs="Arial" w:eastAsia="Arial" w:hAnsi="Arial"/>
+                <w:color w:val="333333"/>
+                <w:sz w:val="18"/>
+                <w:szCs w:val="18"/>
+              </w:rPr>
+              <w:t xml:space="preserve"> </w:t>
+            </w:r>
+          </w:p>
+        </w:tc>
+        <w:tc>
+          <w:tcPr>
+            <w:tcW w:type="dxa" w:w="2600"/>
+            <w:tcBorders>
+              <w:top w:val="single" w:color="E91E8C" w:sz="4"/>
+              <w:left w:val="single" w:color="E91E8C" w:sz="4"/>
+              <w:bottom w:val="single" w:color="E91E8C" w:sz="4"/>
+              <w:right w:val="single" w:color="E91E8C" w:sz="4"/>
+            </w:tcBorders>
+            <w:vAlign w:val="center"/>
+          </w:tcPr>
+          <w:p>
+            <w:r>
+              <w:rPr>
+                <w:rFonts w:ascii="Arial" w:cs="Arial" w:eastAsia="Arial" w:hAnsi="Arial"/>
+                <w:color w:val="333333"/>
+                <w:sz w:val="18"/>
+                <w:szCs w:val="18"/>
+              </w:rPr>
+              <w:t xml:space="preserve">{{hours_17}}</w:t>
+            </w:r>
+          </w:p>
+        </w:tc>
+      </w:tr>
+      <w:tr>
+        <w:trPr>
+          <w:trHeight w:val="600" w:hRule="atLeast"/>
+        </w:trPr>
+        <w:tc>
+          <w:tcPr>
+            <w:tcW w:type="dxa" w:w="2600"/>
+            <w:tcBorders>
+              <w:top w:val="single" w:color="E91E8C" w:sz="4"/>
+              <w:left w:val="single" w:color="E91E8C" w:sz="4"/>
+              <w:bottom w:val="single" w:color="E91E8C" w:sz="4"/>
+              <w:right w:val="single" w:color="E91E8C" w:sz="4"/>
+            </w:tcBorders>
+            <w:vAlign w:val="center"/>
+          </w:tcPr>
+          <w:p>
+            <w:r>
+              <w:rPr>
+                <w:rFonts w:ascii="Arial" w:cs="Arial" w:eastAsia="Arial" w:hAnsi="Arial"/>
+                <w:color w:val="333333"/>
+                <w:sz w:val="18"/>
+                <w:szCs w:val="18"/>
+              </w:rPr>
+              <w:t xml:space="preserve">{{learner_18}}</w:t>
+            </w:r>
+          </w:p>
+        </w:tc>
+        <w:tc>
+          <w:tcPr>
+            <w:tcW w:type="dxa" w:w="2000"/>
+            <w:tcBorders>
+              <w:top w:val="single" w:color="E91E8C" w:sz="4"/>
+              <w:left w:val="single" w:color="E91E8C" w:sz="4"/>
+              <w:bottom w:val="single" w:color="E91E8C" w:sz="4"/>
+              <w:right w:val="single" w:color="E91E8C" w:sz="4"/>
+            </w:tcBorders>
+            <w:vAlign w:val="center"/>
+          </w:tcPr>
+          <w:p>
+            <w:r>
+              <w:rPr>
+                <w:rFonts w:ascii="Arial" w:cs="Arial" w:eastAsia="Arial" w:hAnsi="Arial"/>
+                <w:color w:val="333333"/>
+                <w:sz w:val="18"/>
+                <w:szCs w:val="18"/>
+              </w:rPr>
+              <w:t xml:space="preserve"> </w:t>
+            </w:r>
+          </w:p>
+        </w:tc>
+        <w:tc>
+          <w:tcPr>
+            <w:tcW w:type="dxa" w:w="2000"/>
+            <w:tcBorders>
+              <w:top w:val="single" w:color="E91E8C" w:sz="4"/>
+              <w:left w:val="single" w:color="E91E8C" w:sz="4"/>
+              <w:bottom w:val="single" w:color="E91E8C" w:sz="4"/>
+              <w:right w:val="single" w:color="E91E8C" w:sz="4"/>
+            </w:tcBorders>
+            <w:vAlign w:val="center"/>
+          </w:tcPr>
+          <w:p>
+            <w:r>
+              <w:rPr>
+                <w:rFonts w:ascii="Arial" w:cs="Arial" w:eastAsia="Arial" w:hAnsi="Arial"/>
+                <w:color w:val="333333"/>
+                <w:sz w:val="18"/>
+                <w:szCs w:val="18"/>
+              </w:rPr>
+              <w:t xml:space="preserve"> </w:t>
+            </w:r>
+          </w:p>
+        </w:tc>
+        <w:tc>
+          <w:tcPr>
+            <w:tcW w:type="dxa" w:w="2600"/>
+            <w:tcBorders>
+              <w:top w:val="single" w:color="E91E8C" w:sz="4"/>
+              <w:left w:val="single" w:color="E91E8C" w:sz="4"/>
+              <w:bottom w:val="single" w:color="E91E8C" w:sz="4"/>
+              <w:right w:val="single" w:color="E91E8C" w:sz="4"/>
+            </w:tcBorders>
+            <w:vAlign w:val="center"/>
+          </w:tcPr>
+          <w:p>
+            <w:r>
+              <w:rPr>
+                <w:rFonts w:ascii="Arial" w:cs="Arial" w:eastAsia="Arial" w:hAnsi="Arial"/>
+                <w:color w:val="333333"/>
+                <w:sz w:val="18"/>
+                <w:szCs w:val="18"/>
+              </w:rPr>
+              <w:t xml:space="preserve">{{hours_18}}</w:t>
+            </w:r>
+          </w:p>
+        </w:tc>
+      </w:tr>
+      <w:tr>
+        <w:trPr>
+          <w:trHeight w:val="600" w:hRule="atLeast"/>
+        </w:trPr>
+        <w:tc>
+          <w:tcPr>
+            <w:tcW w:type="dxa" w:w="2600"/>
+            <w:tcBorders>
+              <w:top w:val="single" w:color="E91E8C" w:sz="4"/>
+              <w:left w:val="single" w:color="E91E8C" w:sz="4"/>
+              <w:bottom w:val="single" w:color="E91E8C" w:sz="4"/>
+              <w:right w:val="single" w:color="E91E8C" w:sz="4"/>
+            </w:tcBorders>
+            <w:vAlign w:val="center"/>
+          </w:tcPr>
+          <w:p>
+            <w:r>
+              <w:rPr>
+                <w:rFonts w:ascii="Arial" w:cs="Arial" w:eastAsia="Arial" w:hAnsi="Arial"/>
+                <w:color w:val="333333"/>
+                <w:sz w:val="18"/>
+                <w:szCs w:val="18"/>
+              </w:rPr>
+              <w:t xml:space="preserve">{{learner_19}}</w:t>
+            </w:r>
+          </w:p>
+        </w:tc>
+        <w:tc>
+          <w:tcPr>
+            <w:tcW w:type="dxa" w:w="2000"/>
+            <w:tcBorders>
+              <w:top w:val="single" w:color="E91E8C" w:sz="4"/>
+              <w:left w:val="single" w:color="E91E8C" w:sz="4"/>
+              <w:bottom w:val="single" w:color="E91E8C" w:sz="4"/>
+              <w:right w:val="single" w:color="E91E8C" w:sz="4"/>
+            </w:tcBorders>
+            <w:vAlign w:val="center"/>
+          </w:tcPr>
+          <w:p>
+            <w:r>
+              <w:rPr>
+                <w:rFonts w:ascii="Arial" w:cs="Arial" w:eastAsia="Arial" w:hAnsi="Arial"/>
+                <w:color w:val="333333"/>
+                <w:sz w:val="18"/>
+                <w:szCs w:val="18"/>
+              </w:rPr>
+              <w:t xml:space="preserve"> </w:t>
+            </w:r>
+          </w:p>
+        </w:tc>
+        <w:tc>
+          <w:tcPr>
+            <w:tcW w:type="dxa" w:w="2000"/>
+            <w:tcBorders>
+              <w:top w:val="single" w:color="E91E8C" w:sz="4"/>
+              <w:left w:val="single" w:color="E91E8C" w:sz="4"/>
+              <w:bottom w:val="single" w:color="E91E8C" w:sz="4"/>
+              <w:right w:val="single" w:color="E91E8C" w:sz="4"/>
+            </w:tcBorders>
+            <w:vAlign w:val="center"/>
+          </w:tcPr>
+          <w:p>
+            <w:r>
+              <w:rPr>
+                <w:rFonts w:ascii="Arial" w:cs="Arial" w:eastAsia="Arial" w:hAnsi="Arial"/>
+                <w:color w:val="333333"/>
+                <w:sz w:val="18"/>
+                <w:szCs w:val="18"/>
+              </w:rPr>
+              <w:t xml:space="preserve"> </w:t>
+            </w:r>
+          </w:p>
+        </w:tc>
+        <w:tc>
+          <w:tcPr>
+            <w:tcW w:type="dxa" w:w="2600"/>
+            <w:tcBorders>
+              <w:top w:val="single" w:color="E91E8C" w:sz="4"/>
+              <w:left w:val="single" w:color="E91E8C" w:sz="4"/>
+              <w:bottom w:val="single" w:color="E91E8C" w:sz="4"/>
+              <w:right w:val="single" w:color="E91E8C" w:sz="4"/>
+            </w:tcBorders>
+            <w:vAlign w:val="center"/>
+          </w:tcPr>
+          <w:p>
+            <w:r>
+              <w:rPr>
+                <w:rFonts w:ascii="Arial" w:cs="Arial" w:eastAsia="Arial" w:hAnsi="Arial"/>
+                <w:color w:val="333333"/>
+                <w:sz w:val="18"/>
+                <w:szCs w:val="18"/>
+              </w:rPr>
+              <w:t xml:space="preserve">{{hours_19}}</w:t>
+            </w:r>
+          </w:p>
+        </w:tc>
+      </w:tr>
+      <w:tr>
+        <w:trPr>
+          <w:trHeight w:val="600" w:hRule="atLeast"/>
+        </w:trPr>
+        <w:tc>
+          <w:tcPr>
+            <w:tcW w:type="dxa" w:w="2600"/>
+            <w:tcBorders>
+              <w:top w:val="single" w:color="E91E8C" w:sz="4"/>
+              <w:left w:val="single" w:color="E91E8C" w:sz="4"/>
+              <w:bottom w:val="single" w:color="E91E8C" w:sz="4"/>
+              <w:right w:val="single" w:color="E91E8C" w:sz="4"/>
+            </w:tcBorders>
+            <w:vAlign w:val="center"/>
+          </w:tcPr>
+          <w:p>
+            <w:r>
+              <w:rPr>
+                <w:rFonts w:ascii="Arial" w:cs="Arial" w:eastAsia="Arial" w:hAnsi="Arial"/>
+                <w:color w:val="333333"/>
+                <w:sz w:val="18"/>
+                <w:szCs w:val="18"/>
+              </w:rPr>
+              <w:t xml:space="preserve">{{learner_20}}</w:t>
+            </w:r>
+          </w:p>
+        </w:tc>
+        <w:tc>
+          <w:tcPr>
+            <w:tcW w:type="dxa" w:w="2000"/>
+            <w:tcBorders>
+              <w:top w:val="single" w:color="E91E8C" w:sz="4"/>
+              <w:left w:val="single" w:color="E91E8C" w:sz="4"/>
+              <w:bottom w:val="single" w:color="E91E8C" w:sz="4"/>
+              <w:right w:val="single" w:color="E91E8C" w:sz="4"/>
+            </w:tcBorders>
+            <w:vAlign w:val="center"/>
+          </w:tcPr>
+          <w:p>
+            <w:r>
+              <w:rPr>
+                <w:rFonts w:ascii="Arial" w:cs="Arial" w:eastAsia="Arial" w:hAnsi="Arial"/>
+                <w:color w:val="333333"/>
+                <w:sz w:val="18"/>
+                <w:szCs w:val="18"/>
+              </w:rPr>
+              <w:t xml:space="preserve"> </w:t>
+            </w:r>
+          </w:p>
+        </w:tc>
+        <w:tc>
+          <w:tcPr>
+            <w:tcW w:type="dxa" w:w="2000"/>
+            <w:tcBorders>
+              <w:top w:val="single" w:color="E91E8C" w:sz="4"/>
+              <w:left w:val="single" w:color="E91E8C" w:sz="4"/>
+              <w:bottom w:val="single" w:color="E91E8C" w:sz="4"/>
+              <w:right w:val="single" w:color="E91E8C" w:sz="4"/>
+            </w:tcBorders>
+            <w:vAlign w:val="center"/>
+          </w:tcPr>
+          <w:p>
+            <w:r>
+              <w:rPr>
+                <w:rFonts w:ascii="Arial" w:cs="Arial" w:eastAsia="Arial" w:hAnsi="Arial"/>
+                <w:color w:val="333333"/>
+                <w:sz w:val="18"/>
+                <w:szCs w:val="18"/>
+              </w:rPr>
+              <w:t xml:space="preserve"> </w:t>
+            </w:r>
+          </w:p>
+        </w:tc>
+        <w:tc>
+          <w:tcPr>
+            <w:tcW w:type="dxa" w:w="2600"/>
+            <w:tcBorders>
+              <w:top w:val="single" w:color="E91E8C" w:sz="4"/>
+              <w:left w:val="single" w:color="E91E8C" w:sz="4"/>
+              <w:bottom w:val="single" w:color="E91E8C" w:sz="4"/>
+              <w:right w:val="single" w:color="E91E8C" w:sz="4"/>
+            </w:tcBorders>
+            <w:vAlign w:val="center"/>
+          </w:tcPr>
+          <w:p>
+            <w:r>
+              <w:rPr>
+                <w:rFonts w:ascii="Arial" w:cs="Arial" w:eastAsia="Arial" w:hAnsi="Arial"/>
+                <w:color w:val="333333"/>
+                <w:sz w:val="18"/>
+                <w:szCs w:val="18"/>
+              </w:rPr>
+              <w:t xml:space="preserve">{{hours_20}}</w:t>
             </w:r>
           </w:p>
         </w:tc>

</xml_diff>